<commit_message>
Plan de compra: versión PDF y página web para abrir en el teléfono
Co-Authored-By: Claude Opus 5.5 <noreply@anthropic.com>
Claude-Session: https://claude.ai/code/session_01Waia73eHNWtSrif5AzmwHD
</commit_message>
<xml_diff>
--- a/docs/08-plan-compra-10-carros.docx
+++ b/docs/08-plan-compra-10-carros.docx
@@ -10,7 +10,7 @@
       <w:r>
         <w:drawing>
           <wp:inline distT="0" distB="0" distL="0" distR="0">
-            <wp:extent cx="2095500" cy="880110"/>
+            <wp:extent cx="1905000" cy="1343025"/>
             <wp:effectExtent t="0" r="0" b="0" l="0"/>
             <wp:docPr id="1" name="logo" descr="Logo Josefine Auto" title="Josefine Auto"/>
             <wp:cNvGraphicFramePr>
@@ -35,7 +35,7 @@
                   <pic:spPr bwMode="auto">
                     <a:xfrm>
                       <a:off x="0" y="0"/>
-                      <a:ext cx="2095500" cy="880110"/>
+                      <a:ext cx="1905000" cy="1343025"/>
                     </a:xfrm>
                     <a:prstGeom prst="rect">
                       <a:avLst/>
@@ -200,25 +200,6 @@
         <w:spacing w:after="120"/>
       </w:pPr>
     </w:p>
-    <w:sdt>
-      <w:sdtPr>
-        <w:alias w:val="Contenido"/>
-      </w:sdtPr>
-      <w:sdtContent>
-        <w:p>
-          <w:r>
-            <w:fldChar w:fldCharType="begin" w:dirty="true"/>
-            <w:instrText xml:space="preserve">TOC \h \o "1-2"</w:instrText>
-            <w:fldChar w:fldCharType="separate"/>
-          </w:r>
-        </w:p>
-        <w:p>
-          <w:r>
-            <w:fldChar w:fldCharType="end"/>
-          </w:r>
-        </w:p>
-      </w:sdtContent>
-    </w:sdt>
     <w:p>
       <w:r>
         <w:br w:type="page"/>
@@ -3927,7 +3908,7 @@
             <w:pPr>
               <w:spacing w:after="0"/>
             </w:pPr>
-            <w:hyperlink w:history="1" r:id="rIdy3xfu5ndg5lop7t1zus72">
+            <w:hyperlink w:history="1" r:id="rIdm-xbrr48m1y2riti1tjo0">
               <w:r>
                 <w:rPr>
                   <w:rStyle w:val="Hyperlink"/>
@@ -4080,7 +4061,7 @@
             <w:pPr>
               <w:spacing w:after="0"/>
             </w:pPr>
-            <w:hyperlink w:history="1" r:id="rIdjkabvwegviumejhbncjhv">
+            <w:hyperlink w:history="1" r:id="rIdjt-xv4dvoz3wwgmvtbcfh">
               <w:r>
                 <w:rPr>
                   <w:rStyle w:val="Hyperlink"/>
@@ -4203,7 +4184,7 @@
             <w:pPr>
               <w:spacing w:after="0"/>
             </w:pPr>
-            <w:hyperlink w:history="1" r:id="rIdywkh5b2-syu5a1io9jjmk">
+            <w:hyperlink w:history="1" r:id="rIdl91ppgpq9xonwebtzpt57">
               <w:r>
                 <w:rPr>
                   <w:rStyle w:val="Hyperlink"/>
@@ -4232,7 +4213,7 @@
         </w:rPr>
         <w:t xml:space="preserve">Buscar más hoy: </w:t>
       </w:r>
-      <w:hyperlink w:history="1" r:id="rId-hrfykrfxagshfuwiqnne">
+      <w:hyperlink w:history="1" r:id="rIdkosu5adxz52nddp6e6cfp">
         <w:r>
           <w:rPr>
             <w:rStyle w:val="Hyperlink"/>
@@ -4251,7 +4232,7 @@
         </w:rPr>
         <w:t xml:space="preserve">   ·   </w:t>
       </w:r>
-      <w:hyperlink w:history="1" r:id="rIdtrpwxysi_0or0edgra57u">
+      <w:hyperlink w:history="1" r:id="rIdnfiqx0uedzpoulybkn1gr">
         <w:r>
           <w:rPr>
             <w:rStyle w:val="Hyperlink"/>
@@ -4991,7 +4972,7 @@
             <w:pPr>
               <w:spacing w:after="0"/>
             </w:pPr>
-            <w:hyperlink w:history="1" r:id="rIdj_jk_dknha49dthgyccwp">
+            <w:hyperlink w:history="1" r:id="rIdheq8sfy0gqqi5uuuw_n0n">
               <w:r>
                 <w:rPr>
                   <w:rStyle w:val="Hyperlink"/>
@@ -5020,7 +5001,7 @@
         </w:rPr>
         <w:t xml:space="preserve">Buscar más hoy: </w:t>
       </w:r>
-      <w:hyperlink w:history="1" r:id="rIdh2wyep2mc57qwkllmmvhr">
+      <w:hyperlink w:history="1" r:id="rIdgvmp2fqd8prcki7l99itz">
         <w:r>
           <w:rPr>
             <w:rStyle w:val="Hyperlink"/>
@@ -5039,7 +5020,7 @@
         </w:rPr>
         <w:t xml:space="preserve">   ·   </w:t>
       </w:r>
-      <w:hyperlink w:history="1" r:id="rIdh0tckehndnobg7v155pmy">
+      <w:hyperlink w:history="1" r:id="rIdjksp5omyecqfjmvrwg8kl">
         <w:r>
           <w:rPr>
             <w:rStyle w:val="Hyperlink"/>
@@ -5809,7 +5790,7 @@
             <w:pPr>
               <w:spacing w:after="0"/>
             </w:pPr>
-            <w:hyperlink w:history="1" r:id="rIdcfdmahmiioyv9sbjoamx8">
+            <w:hyperlink w:history="1" r:id="rIdqkjcf_ubdytfqfbdj0kno">
               <w:r>
                 <w:rPr>
                   <w:rStyle w:val="Hyperlink"/>
@@ -5932,7 +5913,7 @@
             <w:pPr>
               <w:spacing w:after="0"/>
             </w:pPr>
-            <w:hyperlink w:history="1" r:id="rIdyn_3g65jurjsibo8xvgnt">
+            <w:hyperlink w:history="1" r:id="rIdzisjl53erf6-jkbesuf4b">
               <w:r>
                 <w:rPr>
                   <w:rStyle w:val="Hyperlink"/>
@@ -6055,7 +6036,7 @@
             <w:pPr>
               <w:spacing w:after="0"/>
             </w:pPr>
-            <w:hyperlink w:history="1" r:id="rIdbb5vecuoardl-qouhbfoz">
+            <w:hyperlink w:history="1" r:id="rIdzr3aum2vf9xdetjqbs8po">
               <w:r>
                 <w:rPr>
                   <w:rStyle w:val="Hyperlink"/>
@@ -6084,7 +6065,7 @@
         </w:rPr>
         <w:t xml:space="preserve">Buscar más hoy: </w:t>
       </w:r>
-      <w:hyperlink w:history="1" r:id="rIdynrunm60ef8w49cbjgfyw">
+      <w:hyperlink w:history="1" r:id="rIdwg7fsd0e8tnoizs5zhrfe">
         <w:r>
           <w:rPr>
             <w:rStyle w:val="Hyperlink"/>
@@ -6103,7 +6084,7 @@
         </w:rPr>
         <w:t xml:space="preserve">   ·   </w:t>
       </w:r>
-      <w:hyperlink w:history="1" r:id="rIdthzf1bcb8khuckckxyfsw">
+      <w:hyperlink w:history="1" r:id="rIdg6-8fnyfqwoeqjyrtm1ui">
         <w:r>
           <w:rPr>
             <w:rStyle w:val="Hyperlink"/>
@@ -6873,7 +6854,7 @@
             <w:pPr>
               <w:spacing w:after="0"/>
             </w:pPr>
-            <w:hyperlink w:history="1" r:id="rIdadmxu8jhhivp58fwb6xd1">
+            <w:hyperlink w:history="1" r:id="rId5gnpudydkaxejc-d9-nkw">
               <w:r>
                 <w:rPr>
                   <w:rStyle w:val="Hyperlink"/>
@@ -6902,7 +6883,7 @@
         </w:rPr>
         <w:t xml:space="preserve">Buscar más hoy: </w:t>
       </w:r>
-      <w:hyperlink w:history="1" r:id="rIdzlskph-nptfpvepv_wazj">
+      <w:hyperlink w:history="1" r:id="rIdzwhojnhzpbljurifsw5gz">
         <w:r>
           <w:rPr>
             <w:rStyle w:val="Hyperlink"/>
@@ -6921,7 +6902,7 @@
         </w:rPr>
         <w:t xml:space="preserve">   ·   </w:t>
       </w:r>
-      <w:hyperlink w:history="1" r:id="rId1f9hatfdormho8ypbneui">
+      <w:hyperlink w:history="1" r:id="rIdpoe6ofssye5dpy6tougw7">
         <w:r>
           <w:rPr>
             <w:rStyle w:val="Hyperlink"/>
@@ -7691,7 +7672,7 @@
             <w:pPr>
               <w:spacing w:after="0"/>
             </w:pPr>
-            <w:hyperlink w:history="1" r:id="rIde1o9skfmmztfspq0ntuas">
+            <w:hyperlink w:history="1" r:id="rIdzcznqiqtgchyoywnkjsoy">
               <w:r>
                 <w:rPr>
                   <w:rStyle w:val="Hyperlink"/>
@@ -7844,7 +7825,7 @@
             <w:pPr>
               <w:spacing w:after="0"/>
             </w:pPr>
-            <w:hyperlink w:history="1" r:id="rId8nb6mm-y-2ybgizmgwym_">
+            <w:hyperlink w:history="1" r:id="rIdd8sifup7cuwqnkgm7r8xh">
               <w:r>
                 <w:rPr>
                   <w:rStyle w:val="Hyperlink"/>
@@ -7997,7 +7978,7 @@
             <w:pPr>
               <w:spacing w:after="0"/>
             </w:pPr>
-            <w:hyperlink w:history="1" r:id="rId3wix4z-a0bhfdefpop2or">
+            <w:hyperlink w:history="1" r:id="rIdzkasabzgcoh7hl5wonobp">
               <w:r>
                 <w:rPr>
                   <w:rStyle w:val="Hyperlink"/>
@@ -8026,7 +8007,7 @@
         </w:rPr>
         <w:t xml:space="preserve">Buscar más hoy: </w:t>
       </w:r>
-      <w:hyperlink w:history="1" r:id="rIduxfeeqqq0y2bnsy-efu4u">
+      <w:hyperlink w:history="1" r:id="rIdlyqmiog_gueyjlgcriin9">
         <w:r>
           <w:rPr>
             <w:rStyle w:val="Hyperlink"/>
@@ -8045,7 +8026,7 @@
         </w:rPr>
         <w:t xml:space="preserve">   ·   </w:t>
       </w:r>
-      <w:hyperlink w:history="1" r:id="rIdicjrawqr1fgp-detddngp">
+      <w:hyperlink w:history="1" r:id="rIdjlhjbyhd_knpgx0a2ut9k">
         <w:r>
           <w:rPr>
             <w:rStyle w:val="Hyperlink"/>
@@ -8815,7 +8796,7 @@
             <w:pPr>
               <w:spacing w:after="0"/>
             </w:pPr>
-            <w:hyperlink w:history="1" r:id="rIdl3soorcvpnelbm1asmc9d">
+            <w:hyperlink w:history="1" r:id="rIdou1glodb0x4rkdetrx0l9">
               <w:r>
                 <w:rPr>
                   <w:rStyle w:val="Hyperlink"/>
@@ -8968,7 +8949,7 @@
             <w:pPr>
               <w:spacing w:after="0"/>
             </w:pPr>
-            <w:hyperlink w:history="1" r:id="rIdemraevnoy_bx8fryjhs3x">
+            <w:hyperlink w:history="1" r:id="rIdnjpzyzj4cfm8n-is-95ct">
               <w:r>
                 <w:rPr>
                   <w:rStyle w:val="Hyperlink"/>
@@ -9121,7 +9102,7 @@
             <w:pPr>
               <w:spacing w:after="0"/>
             </w:pPr>
-            <w:hyperlink w:history="1" r:id="rIdwvf01xwiyve7t14m9zs3m">
+            <w:hyperlink w:history="1" r:id="rIdsevfc8zzzqoettkoejz-8">
               <w:r>
                 <w:rPr>
                   <w:rStyle w:val="Hyperlink"/>
@@ -9150,7 +9131,7 @@
         </w:rPr>
         <w:t xml:space="preserve">Buscar más hoy: </w:t>
       </w:r>
-      <w:hyperlink w:history="1" r:id="rIdty0p7x6kpky2rb_brndos">
+      <w:hyperlink w:history="1" r:id="rIdtplqih7rzegn17wyhhic4">
         <w:r>
           <w:rPr>
             <w:rStyle w:val="Hyperlink"/>
@@ -9169,7 +9150,7 @@
         </w:rPr>
         <w:t xml:space="preserve">   ·   </w:t>
       </w:r>
-      <w:hyperlink w:history="1" r:id="rIdhgs4lznlrghylmihe9f_v">
+      <w:hyperlink w:history="1" r:id="rIdme01iplmtzao85lzlalix">
         <w:r>
           <w:rPr>
             <w:rStyle w:val="Hyperlink"/>
@@ -9939,7 +9920,7 @@
             <w:pPr>
               <w:spacing w:after="0"/>
             </w:pPr>
-            <w:hyperlink w:history="1" r:id="rIdfdtoanlbgxpigbrs7wpoh">
+            <w:hyperlink w:history="1" r:id="rIdamsy_d0lcfoluqw4olfwa">
               <w:r>
                 <w:rPr>
                   <w:rStyle w:val="Hyperlink"/>
@@ -10092,7 +10073,7 @@
             <w:pPr>
               <w:spacing w:after="0"/>
             </w:pPr>
-            <w:hyperlink w:history="1" r:id="rId8slcnn1ddgbxfmvknndqq">
+            <w:hyperlink w:history="1" r:id="rIdi1bpeibiunsxch2unfar6">
               <w:r>
                 <w:rPr>
                   <w:rStyle w:val="Hyperlink"/>
@@ -10121,7 +10102,7 @@
         </w:rPr>
         <w:t xml:space="preserve">Buscar más hoy: </w:t>
       </w:r>
-      <w:hyperlink w:history="1" r:id="rId24ijv3pvuj8aqw8tyepgf">
+      <w:hyperlink w:history="1" r:id="rIdsndkei25jmm4zegchbtrf">
         <w:r>
           <w:rPr>
             <w:rStyle w:val="Hyperlink"/>
@@ -10140,7 +10121,7 @@
         </w:rPr>
         <w:t xml:space="preserve">   ·   </w:t>
       </w:r>
-      <w:hyperlink w:history="1" r:id="rId45qfzq-p0_8g-r7gkf2v5">
+      <w:hyperlink w:history="1" r:id="rId4yddbdpplo4kftoil4pqh">
         <w:r>
           <w:rPr>
             <w:rStyle w:val="Hyperlink"/>
@@ -10910,7 +10891,7 @@
             <w:pPr>
               <w:spacing w:after="0"/>
             </w:pPr>
-            <w:hyperlink w:history="1" r:id="rIdcywmgrx2xivh6-thahusj">
+            <w:hyperlink w:history="1" r:id="rIdgcbt2wgdixpdvzy9drawl">
               <w:r>
                 <w:rPr>
                   <w:rStyle w:val="Hyperlink"/>
@@ -11063,7 +11044,7 @@
             <w:pPr>
               <w:spacing w:after="0"/>
             </w:pPr>
-            <w:hyperlink w:history="1" r:id="rIdb_pbafddxtrzexjcweimv">
+            <w:hyperlink w:history="1" r:id="rIdz6m1aojyjhanthwx2n-db">
               <w:r>
                 <w:rPr>
                   <w:rStyle w:val="Hyperlink"/>
@@ -11186,7 +11167,7 @@
             <w:pPr>
               <w:spacing w:after="0"/>
             </w:pPr>
-            <w:hyperlink w:history="1" r:id="rId2ep7_aud1y2ntmq4w5x9k">
+            <w:hyperlink w:history="1" r:id="rIdtpcnaskkmzh3og1kgjoiq">
               <w:r>
                 <w:rPr>
                   <w:rStyle w:val="Hyperlink"/>
@@ -11215,7 +11196,7 @@
         </w:rPr>
         <w:t xml:space="preserve">Buscar más hoy: </w:t>
       </w:r>
-      <w:hyperlink w:history="1" r:id="rIdx9eoji_pizfr7zzdyxpbl">
+      <w:hyperlink w:history="1" r:id="rId-lhubm_llyxluckitzbag">
         <w:r>
           <w:rPr>
             <w:rStyle w:val="Hyperlink"/>
@@ -11234,7 +11215,7 @@
         </w:rPr>
         <w:t xml:space="preserve">   ·   </w:t>
       </w:r>
-      <w:hyperlink w:history="1" r:id="rId43ifmuybmqedtyaaqe_ek">
+      <w:hyperlink w:history="1" r:id="rIdm15gif_1vxmjvfnbx3j-g">
         <w:r>
           <w:rPr>
             <w:rStyle w:val="Hyperlink"/>
@@ -12004,7 +11985,7 @@
             <w:pPr>
               <w:spacing w:after="0"/>
             </w:pPr>
-            <w:hyperlink w:history="1" r:id="rIdvjthpmpedvxtjbb2rbzd4">
+            <w:hyperlink w:history="1" r:id="rIdt7riswxmxfl77evlx3hhn">
               <w:r>
                 <w:rPr>
                   <w:rStyle w:val="Hyperlink"/>
@@ -12157,7 +12138,7 @@
             <w:pPr>
               <w:spacing w:after="0"/>
             </w:pPr>
-            <w:hyperlink w:history="1" r:id="rIdjxdjtrzftmulfbjuz0xcb">
+            <w:hyperlink w:history="1" r:id="rIdi9k6digolycrmolmboqpw">
               <w:r>
                 <w:rPr>
                   <w:rStyle w:val="Hyperlink"/>
@@ -12280,7 +12261,7 @@
             <w:pPr>
               <w:spacing w:after="0"/>
             </w:pPr>
-            <w:hyperlink w:history="1" r:id="rIdhtjo2nz0cnuh2bh5nnz7a">
+            <w:hyperlink w:history="1" r:id="rId4xmyzyxefat4f1gw6zudd">
               <w:r>
                 <w:rPr>
                   <w:rStyle w:val="Hyperlink"/>
@@ -12309,7 +12290,7 @@
         </w:rPr>
         <w:t xml:space="preserve">Buscar más hoy: </w:t>
       </w:r>
-      <w:hyperlink w:history="1" r:id="rIdzjipmlq4fzxyahmbsfdfi">
+      <w:hyperlink w:history="1" r:id="rId1kvuy_pavglihxvlxjjye">
         <w:r>
           <w:rPr>
             <w:rStyle w:val="Hyperlink"/>
@@ -12328,7 +12309,7 @@
         </w:rPr>
         <w:t xml:space="preserve">   ·   </w:t>
       </w:r>
-      <w:hyperlink w:history="1" r:id="rIdgxk6t_mqulmpr0hg7zl_n">
+      <w:hyperlink w:history="1" r:id="rIdxldlwpaxgvzauxlywzi2f">
         <w:r>
           <w:rPr>
             <w:rStyle w:val="Hyperlink"/>
@@ -13098,7 +13079,7 @@
             <w:pPr>
               <w:spacing w:after="0"/>
             </w:pPr>
-            <w:hyperlink w:history="1" r:id="rId4edng0yqco55bfzt1sjs2">
+            <w:hyperlink w:history="1" r:id="rIdehejdz71wu8vdpkynhrvc">
               <w:r>
                 <w:rPr>
                   <w:rStyle w:val="Hyperlink"/>
@@ -13251,7 +13232,7 @@
             <w:pPr>
               <w:spacing w:after="0"/>
             </w:pPr>
-            <w:hyperlink w:history="1" r:id="rIdcx--9llyf0ldkms9xqaj6">
+            <w:hyperlink w:history="1" r:id="rId7-q1eb9srbr4dqy0bsk1i">
               <w:r>
                 <w:rPr>
                   <w:rStyle w:val="Hyperlink"/>
@@ -13404,7 +13385,7 @@
             <w:pPr>
               <w:spacing w:after="0"/>
             </w:pPr>
-            <w:hyperlink w:history="1" r:id="rIdbygtyf_uf_grqctq2ue_g">
+            <w:hyperlink w:history="1" r:id="rId_gkrx6pssfpawwiudqkyn">
               <w:r>
                 <w:rPr>
                   <w:rStyle w:val="Hyperlink"/>
@@ -13433,7 +13414,7 @@
         </w:rPr>
         <w:t xml:space="preserve">Buscar más hoy: </w:t>
       </w:r>
-      <w:hyperlink w:history="1" r:id="rId9xa1rerggahrbybkshfjv">
+      <w:hyperlink w:history="1" r:id="rId1rugneoqy0c4fgnstz5wj">
         <w:r>
           <w:rPr>
             <w:rStyle w:val="Hyperlink"/>
@@ -13452,7 +13433,7 @@
         </w:rPr>
         <w:t xml:space="preserve">   ·   </w:t>
       </w:r>
-      <w:hyperlink w:history="1" r:id="rIdlhcldtfe5bzpxr4_ngucp">
+      <w:hyperlink w:history="1" r:id="rId2fzr5kvoec6tp7mkqp7kb">
         <w:r>
           <w:rPr>
             <w:rStyle w:val="Hyperlink"/>

</xml_diff>

<commit_message>
Plan de compra: contacto por anuncio (WhatsApp directo cuando el número es público)
Co-Authored-By: Claude Opus 5.5 <noreply@anthropic.com>
Claude-Session: https://claude.ai/code/session_01Waia73eHNWtSrif5AzmwHD
</commit_message>
<xml_diff>
--- a/docs/08-plan-compra-10-carros.docx
+++ b/docs/08-plan-compra-10-carros.docx
@@ -3906,9 +3906,33 @@
           </w:p>
           <w:p>
             <w:pPr>
-              <w:spacing w:after="0"/>
-            </w:pPr>
-            <w:hyperlink w:history="1" r:id="rIdm-xbrr48m1y2riti1tjo0">
+              <w:spacing w:after="40"/>
+            </w:pPr>
+            <w:r>
+              <w:rPr>
+                <w:rFonts w:ascii="Arial" w:cs="Arial" w:eastAsia="Arial" w:hAnsi="Arial"/>
+                <w:b/>
+                <w:bCs/>
+                <w:sz w:val="21"/>
+                <w:szCs w:val="21"/>
+              </w:rPr>
+              <w:t xml:space="preserve">📞 Teléfono: </w:t>
+            </w:r>
+            <w:r>
+              <w:rPr>
+                <w:rFonts w:ascii="Arial" w:cs="Arial" w:eastAsia="Arial" w:hAnsi="Arial"/>
+                <w:color w:val="5B6270"/>
+                <w:sz w:val="18"/>
+                <w:szCs w:val="18"/>
+              </w:rPr>
+              <w:t xml:space="preserve">oculto por encuentra24.com. Toca “Abrir anuncio” y luego el botón verde de WhatsApp o “Ver teléfono”.</w:t>
+            </w:r>
+          </w:p>
+          <w:p>
+            <w:pPr>
+              <w:spacing w:after="0"/>
+            </w:pPr>
+            <w:hyperlink w:history="1" r:id="rId_pxq8h2mtgdvxmaoze33v">
               <w:r>
                 <w:rPr>
                   <w:rStyle w:val="Hyperlink"/>
@@ -4059,9 +4083,33 @@
           </w:p>
           <w:p>
             <w:pPr>
-              <w:spacing w:after="0"/>
-            </w:pPr>
-            <w:hyperlink w:history="1" r:id="rIdjt-xv4dvoz3wwgmvtbcfh">
+              <w:spacing w:after="40"/>
+            </w:pPr>
+            <w:r>
+              <w:rPr>
+                <w:rFonts w:ascii="Arial" w:cs="Arial" w:eastAsia="Arial" w:hAnsi="Arial"/>
+                <w:b/>
+                <w:bCs/>
+                <w:sz w:val="21"/>
+                <w:szCs w:val="21"/>
+              </w:rPr>
+              <w:t xml:space="preserve">📞 Teléfono: </w:t>
+            </w:r>
+            <w:r>
+              <w:rPr>
+                <w:rFonts w:ascii="Arial" w:cs="Arial" w:eastAsia="Arial" w:hAnsi="Arial"/>
+                <w:color w:val="5B6270"/>
+                <w:sz w:val="18"/>
+                <w:szCs w:val="18"/>
+              </w:rPr>
+              <w:t xml:space="preserve">oculto por encuentra24.com. Toca “Abrir anuncio” y luego el botón verde de WhatsApp o “Ver teléfono”.</w:t>
+            </w:r>
+          </w:p>
+          <w:p>
+            <w:pPr>
+              <w:spacing w:after="0"/>
+            </w:pPr>
+            <w:hyperlink w:history="1" r:id="rId3oipbekxnrx_wkgevkarw">
               <w:r>
                 <w:rPr>
                   <w:rStyle w:val="Hyperlink"/>
@@ -4182,9 +4230,33 @@
           </w:p>
           <w:p>
             <w:pPr>
-              <w:spacing w:after="0"/>
-            </w:pPr>
-            <w:hyperlink w:history="1" r:id="rIdl91ppgpq9xonwebtzpt57">
+              <w:spacing w:after="40"/>
+            </w:pPr>
+            <w:r>
+              <w:rPr>
+                <w:rFonts w:ascii="Arial" w:cs="Arial" w:eastAsia="Arial" w:hAnsi="Arial"/>
+                <w:b/>
+                <w:bCs/>
+                <w:sz w:val="21"/>
+                <w:szCs w:val="21"/>
+              </w:rPr>
+              <w:t xml:space="preserve">📞 Teléfono: </w:t>
+            </w:r>
+            <w:r>
+              <w:rPr>
+                <w:rFonts w:ascii="Arial" w:cs="Arial" w:eastAsia="Arial" w:hAnsi="Arial"/>
+                <w:color w:val="5B6270"/>
+                <w:sz w:val="18"/>
+                <w:szCs w:val="18"/>
+              </w:rPr>
+              <w:t xml:space="preserve">oculto por encuentra24.com. Toca “Abrir anuncio” y luego el botón verde de WhatsApp o “Ver teléfono”.</w:t>
+            </w:r>
+          </w:p>
+          <w:p>
+            <w:pPr>
+              <w:spacing w:after="0"/>
+            </w:pPr>
+            <w:hyperlink w:history="1" r:id="rIdpagx4cv1_hr-hfg8uh5nv">
               <w:r>
                 <w:rPr>
                   <w:rStyle w:val="Hyperlink"/>
@@ -4213,7 +4285,7 @@
         </w:rPr>
         <w:t xml:space="preserve">Buscar más hoy: </w:t>
       </w:r>
-      <w:hyperlink w:history="1" r:id="rIdkosu5adxz52nddp6e6cfp">
+      <w:hyperlink w:history="1" r:id="rIdyjeditrjxn1x3lirz57hr">
         <w:r>
           <w:rPr>
             <w:rStyle w:val="Hyperlink"/>
@@ -4232,7 +4304,7 @@
         </w:rPr>
         <w:t xml:space="preserve">   ·   </w:t>
       </w:r>
-      <w:hyperlink w:history="1" r:id="rIdnfiqx0uedzpoulybkn1gr">
+      <w:hyperlink w:history="1" r:id="rIdxqwmjdscqpt4rymjbiqcy">
         <w:r>
           <w:rPr>
             <w:rStyle w:val="Hyperlink"/>
@@ -4970,9 +5042,33 @@
           </w:p>
           <w:p>
             <w:pPr>
-              <w:spacing w:after="0"/>
-            </w:pPr>
-            <w:hyperlink w:history="1" r:id="rIdheq8sfy0gqqi5uuuw_n0n">
+              <w:spacing w:after="40"/>
+            </w:pPr>
+            <w:r>
+              <w:rPr>
+                <w:rFonts w:ascii="Arial" w:cs="Arial" w:eastAsia="Arial" w:hAnsi="Arial"/>
+                <w:b/>
+                <w:bCs/>
+                <w:sz w:val="21"/>
+                <w:szCs w:val="21"/>
+              </w:rPr>
+              <w:t xml:space="preserve">📞 Teléfono: </w:t>
+            </w:r>
+            <w:r>
+              <w:rPr>
+                <w:rFonts w:ascii="Arial" w:cs="Arial" w:eastAsia="Arial" w:hAnsi="Arial"/>
+                <w:color w:val="5B6270"/>
+                <w:sz w:val="18"/>
+                <w:szCs w:val="18"/>
+              </w:rPr>
+              <w:t xml:space="preserve">oculto por encuentra24.com. Toca “Abrir anuncio” y luego el botón verde de WhatsApp o “Ver teléfono”.</w:t>
+            </w:r>
+          </w:p>
+          <w:p>
+            <w:pPr>
+              <w:spacing w:after="0"/>
+            </w:pPr>
+            <w:hyperlink w:history="1" r:id="rIdm0qk4k-eoq9jtg7pqhmep">
               <w:r>
                 <w:rPr>
                   <w:rStyle w:val="Hyperlink"/>
@@ -5001,7 +5097,7 @@
         </w:rPr>
         <w:t xml:space="preserve">Buscar más hoy: </w:t>
       </w:r>
-      <w:hyperlink w:history="1" r:id="rIdgvmp2fqd8prcki7l99itz">
+      <w:hyperlink w:history="1" r:id="rIdnqx7rxt_z5zzatawslg_y">
         <w:r>
           <w:rPr>
             <w:rStyle w:val="Hyperlink"/>
@@ -5020,7 +5116,7 @@
         </w:rPr>
         <w:t xml:space="preserve">   ·   </w:t>
       </w:r>
-      <w:hyperlink w:history="1" r:id="rIdjksp5omyecqfjmvrwg8kl">
+      <w:hyperlink w:history="1" r:id="rIdpcbufophjfl05qmlx7l9y">
         <w:r>
           <w:rPr>
             <w:rStyle w:val="Hyperlink"/>
@@ -5788,9 +5884,33 @@
           </w:p>
           <w:p>
             <w:pPr>
-              <w:spacing w:after="0"/>
-            </w:pPr>
-            <w:hyperlink w:history="1" r:id="rIdqkjcf_ubdytfqfbdj0kno">
+              <w:spacing w:after="40"/>
+            </w:pPr>
+            <w:r>
+              <w:rPr>
+                <w:rFonts w:ascii="Arial" w:cs="Arial" w:eastAsia="Arial" w:hAnsi="Arial"/>
+                <w:b/>
+                <w:bCs/>
+                <w:sz w:val="21"/>
+                <w:szCs w:val="21"/>
+              </w:rPr>
+              <w:t xml:space="preserve">📞 Teléfono: </w:t>
+            </w:r>
+            <w:r>
+              <w:rPr>
+                <w:rFonts w:ascii="Arial" w:cs="Arial" w:eastAsia="Arial" w:hAnsi="Arial"/>
+                <w:color w:val="5B6270"/>
+                <w:sz w:val="18"/>
+                <w:szCs w:val="18"/>
+              </w:rPr>
+              <w:t xml:space="preserve">oculto por carrocarros.com. Toca “Abrir anuncio” y luego el botón verde de WhatsApp o “Ver teléfono”.</w:t>
+            </w:r>
+          </w:p>
+          <w:p>
+            <w:pPr>
+              <w:spacing w:after="0"/>
+            </w:pPr>
+            <w:hyperlink w:history="1" r:id="rIdlhkyh-8yirmqxqspm7kro">
               <w:r>
                 <w:rPr>
                   <w:rStyle w:val="Hyperlink"/>
@@ -5911,9 +6031,33 @@
           </w:p>
           <w:p>
             <w:pPr>
-              <w:spacing w:after="0"/>
-            </w:pPr>
-            <w:hyperlink w:history="1" r:id="rIdzisjl53erf6-jkbesuf4b">
+              <w:spacing w:after="40"/>
+            </w:pPr>
+            <w:r>
+              <w:rPr>
+                <w:rFonts w:ascii="Arial" w:cs="Arial" w:eastAsia="Arial" w:hAnsi="Arial"/>
+                <w:b/>
+                <w:bCs/>
+                <w:sz w:val="21"/>
+                <w:szCs w:val="21"/>
+              </w:rPr>
+              <w:t xml:space="preserve">📞 Teléfono: </w:t>
+            </w:r>
+            <w:r>
+              <w:rPr>
+                <w:rFonts w:ascii="Arial" w:cs="Arial" w:eastAsia="Arial" w:hAnsi="Arial"/>
+                <w:color w:val="5B6270"/>
+                <w:sz w:val="18"/>
+                <w:szCs w:val="18"/>
+              </w:rPr>
+              <w:t xml:space="preserve">oculto por encuentra24.com. Toca “Abrir anuncio” y luego el botón verde de WhatsApp o “Ver teléfono”.</w:t>
+            </w:r>
+          </w:p>
+          <w:p>
+            <w:pPr>
+              <w:spacing w:after="0"/>
+            </w:pPr>
+            <w:hyperlink w:history="1" r:id="rId9ilbqoggztdwqh17pm3co">
               <w:r>
                 <w:rPr>
                   <w:rStyle w:val="Hyperlink"/>
@@ -6034,9 +6178,33 @@
           </w:p>
           <w:p>
             <w:pPr>
-              <w:spacing w:after="0"/>
-            </w:pPr>
-            <w:hyperlink w:history="1" r:id="rIdzr3aum2vf9xdetjqbs8po">
+              <w:spacing w:after="40"/>
+            </w:pPr>
+            <w:r>
+              <w:rPr>
+                <w:rFonts w:ascii="Arial" w:cs="Arial" w:eastAsia="Arial" w:hAnsi="Arial"/>
+                <w:b/>
+                <w:bCs/>
+                <w:sz w:val="21"/>
+                <w:szCs w:val="21"/>
+              </w:rPr>
+              <w:t xml:space="preserve">📞 Teléfono: </w:t>
+            </w:r>
+            <w:r>
+              <w:rPr>
+                <w:rFonts w:ascii="Arial" w:cs="Arial" w:eastAsia="Arial" w:hAnsi="Arial"/>
+                <w:color w:val="5B6270"/>
+                <w:sz w:val="18"/>
+                <w:szCs w:val="18"/>
+              </w:rPr>
+              <w:t xml:space="preserve">oculto por encuentra24.com. Toca “Abrir anuncio” y luego el botón verde de WhatsApp o “Ver teléfono”.</w:t>
+            </w:r>
+          </w:p>
+          <w:p>
+            <w:pPr>
+              <w:spacing w:after="0"/>
+            </w:pPr>
+            <w:hyperlink w:history="1" r:id="rIdmsuyosq51uxhtbzkpf7pw">
               <w:r>
                 <w:rPr>
                   <w:rStyle w:val="Hyperlink"/>
@@ -6065,7 +6233,7 @@
         </w:rPr>
         <w:t xml:space="preserve">Buscar más hoy: </w:t>
       </w:r>
-      <w:hyperlink w:history="1" r:id="rIdwg7fsd0e8tnoizs5zhrfe">
+      <w:hyperlink w:history="1" r:id="rIdcntnzjp6i4sukm1f2gkgu">
         <w:r>
           <w:rPr>
             <w:rStyle w:val="Hyperlink"/>
@@ -6084,7 +6252,7 @@
         </w:rPr>
         <w:t xml:space="preserve">   ·   </w:t>
       </w:r>
-      <w:hyperlink w:history="1" r:id="rIdg6-8fnyfqwoeqjyrtm1ui">
+      <w:hyperlink w:history="1" r:id="rId0kco81u8vkwx96sx4xmdk">
         <w:r>
           <w:rPr>
             <w:rStyle w:val="Hyperlink"/>
@@ -6852,9 +7020,33 @@
           </w:p>
           <w:p>
             <w:pPr>
-              <w:spacing w:after="0"/>
-            </w:pPr>
-            <w:hyperlink w:history="1" r:id="rId5gnpudydkaxejc-d9-nkw">
+              <w:spacing w:after="40"/>
+            </w:pPr>
+            <w:r>
+              <w:rPr>
+                <w:rFonts w:ascii="Arial" w:cs="Arial" w:eastAsia="Arial" w:hAnsi="Arial"/>
+                <w:b/>
+                <w:bCs/>
+                <w:sz w:val="21"/>
+                <w:szCs w:val="21"/>
+              </w:rPr>
+              <w:t xml:space="preserve">📞 Teléfono: </w:t>
+            </w:r>
+            <w:r>
+              <w:rPr>
+                <w:rFonts w:ascii="Arial" w:cs="Arial" w:eastAsia="Arial" w:hAnsi="Arial"/>
+                <w:color w:val="5B6270"/>
+                <w:sz w:val="18"/>
+                <w:szCs w:val="18"/>
+              </w:rPr>
+              <w:t xml:space="preserve">oculto por encuentra24.com. Toca “Abrir anuncio” y luego el botón verde de WhatsApp o “Ver teléfono”.</w:t>
+            </w:r>
+          </w:p>
+          <w:p>
+            <w:pPr>
+              <w:spacing w:after="0"/>
+            </w:pPr>
+            <w:hyperlink w:history="1" r:id="rId3_qca2z3krys6ectbouh0">
               <w:r>
                 <w:rPr>
                   <w:rStyle w:val="Hyperlink"/>
@@ -6883,7 +7075,7 @@
         </w:rPr>
         <w:t xml:space="preserve">Buscar más hoy: </w:t>
       </w:r>
-      <w:hyperlink w:history="1" r:id="rIdzwhojnhzpbljurifsw5gz">
+      <w:hyperlink w:history="1" r:id="rIduyqlugsa4fvf6i3y5g_gq">
         <w:r>
           <w:rPr>
             <w:rStyle w:val="Hyperlink"/>
@@ -6902,7 +7094,7 @@
         </w:rPr>
         <w:t xml:space="preserve">   ·   </w:t>
       </w:r>
-      <w:hyperlink w:history="1" r:id="rIdpoe6ofssye5dpy6tougw7">
+      <w:hyperlink w:history="1" r:id="rIdfljcz05wegatvw0agsglr">
         <w:r>
           <w:rPr>
             <w:rStyle w:val="Hyperlink"/>
@@ -7670,9 +7862,33 @@
           </w:p>
           <w:p>
             <w:pPr>
-              <w:spacing w:after="0"/>
-            </w:pPr>
-            <w:hyperlink w:history="1" r:id="rIdzcznqiqtgchyoywnkjsoy">
+              <w:spacing w:after="40"/>
+            </w:pPr>
+            <w:r>
+              <w:rPr>
+                <w:rFonts w:ascii="Arial" w:cs="Arial" w:eastAsia="Arial" w:hAnsi="Arial"/>
+                <w:b/>
+                <w:bCs/>
+                <w:sz w:val="21"/>
+                <w:szCs w:val="21"/>
+              </w:rPr>
+              <w:t xml:space="preserve">📞 Teléfono: </w:t>
+            </w:r>
+            <w:r>
+              <w:rPr>
+                <w:rFonts w:ascii="Arial" w:cs="Arial" w:eastAsia="Arial" w:hAnsi="Arial"/>
+                <w:color w:val="5B6270"/>
+                <w:sz w:val="18"/>
+                <w:szCs w:val="18"/>
+              </w:rPr>
+              <w:t xml:space="preserve">oculto por encuentra24.com. Toca “Abrir anuncio” y luego el botón verde de WhatsApp o “Ver teléfono”.</w:t>
+            </w:r>
+          </w:p>
+          <w:p>
+            <w:pPr>
+              <w:spacing w:after="0"/>
+            </w:pPr>
+            <w:hyperlink w:history="1" r:id="rId5yqicapvintystzmf1xbf">
               <w:r>
                 <w:rPr>
                   <w:rStyle w:val="Hyperlink"/>
@@ -7823,9 +8039,33 @@
           </w:p>
           <w:p>
             <w:pPr>
-              <w:spacing w:after="0"/>
-            </w:pPr>
-            <w:hyperlink w:history="1" r:id="rIdd8sifup7cuwqnkgm7r8xh">
+              <w:spacing w:after="40"/>
+            </w:pPr>
+            <w:r>
+              <w:rPr>
+                <w:rFonts w:ascii="Arial" w:cs="Arial" w:eastAsia="Arial" w:hAnsi="Arial"/>
+                <w:b/>
+                <w:bCs/>
+                <w:sz w:val="21"/>
+                <w:szCs w:val="21"/>
+              </w:rPr>
+              <w:t xml:space="preserve">📞 Teléfono: </w:t>
+            </w:r>
+            <w:r>
+              <w:rPr>
+                <w:rFonts w:ascii="Arial" w:cs="Arial" w:eastAsia="Arial" w:hAnsi="Arial"/>
+                <w:color w:val="5B6270"/>
+                <w:sz w:val="18"/>
+                <w:szCs w:val="18"/>
+              </w:rPr>
+              <w:t xml:space="preserve">oculto por encuentra24.com. Toca “Abrir anuncio” y luego el botón verde de WhatsApp o “Ver teléfono”.</w:t>
+            </w:r>
+          </w:p>
+          <w:p>
+            <w:pPr>
+              <w:spacing w:after="0"/>
+            </w:pPr>
+            <w:hyperlink w:history="1" r:id="rIdgrjcqmyalaryfictd9cwn">
               <w:r>
                 <w:rPr>
                   <w:rStyle w:val="Hyperlink"/>
@@ -7976,9 +8216,33 @@
           </w:p>
           <w:p>
             <w:pPr>
-              <w:spacing w:after="0"/>
-            </w:pPr>
-            <w:hyperlink w:history="1" r:id="rIdzkasabzgcoh7hl5wonobp">
+              <w:spacing w:after="40"/>
+            </w:pPr>
+            <w:r>
+              <w:rPr>
+                <w:rFonts w:ascii="Arial" w:cs="Arial" w:eastAsia="Arial" w:hAnsi="Arial"/>
+                <w:b/>
+                <w:bCs/>
+                <w:sz w:val="21"/>
+                <w:szCs w:val="21"/>
+              </w:rPr>
+              <w:t xml:space="preserve">📞 Teléfono: </w:t>
+            </w:r>
+            <w:r>
+              <w:rPr>
+                <w:rFonts w:ascii="Arial" w:cs="Arial" w:eastAsia="Arial" w:hAnsi="Arial"/>
+                <w:color w:val="5B6270"/>
+                <w:sz w:val="18"/>
+                <w:szCs w:val="18"/>
+              </w:rPr>
+              <w:t xml:space="preserve">oculto por encuentra24.com. Toca “Abrir anuncio” y luego el botón verde de WhatsApp o “Ver teléfono”.</w:t>
+            </w:r>
+          </w:p>
+          <w:p>
+            <w:pPr>
+              <w:spacing w:after="0"/>
+            </w:pPr>
+            <w:hyperlink w:history="1" r:id="rIdevzvlxvxbz8udxflstxva">
               <w:r>
                 <w:rPr>
                   <w:rStyle w:val="Hyperlink"/>
@@ -8007,7 +8271,7 @@
         </w:rPr>
         <w:t xml:space="preserve">Buscar más hoy: </w:t>
       </w:r>
-      <w:hyperlink w:history="1" r:id="rIdlyqmiog_gueyjlgcriin9">
+      <w:hyperlink w:history="1" r:id="rIdpokvnrhovmkqirbbficdm">
         <w:r>
           <w:rPr>
             <w:rStyle w:val="Hyperlink"/>
@@ -8026,7 +8290,7 @@
         </w:rPr>
         <w:t xml:space="preserve">   ·   </w:t>
       </w:r>
-      <w:hyperlink w:history="1" r:id="rIdjlhjbyhd_knpgx0a2ut9k">
+      <w:hyperlink w:history="1" r:id="rId2w4xctkug44szvlidlayw">
         <w:r>
           <w:rPr>
             <w:rStyle w:val="Hyperlink"/>
@@ -8794,9 +9058,51 @@
           </w:p>
           <w:p>
             <w:pPr>
-              <w:spacing w:after="0"/>
-            </w:pPr>
-            <w:hyperlink w:history="1" r:id="rIdou1glodb0x4rkdetrx0l9">
+              <w:spacing w:after="40"/>
+            </w:pPr>
+            <w:r>
+              <w:rPr>
+                <w:rFonts w:ascii="Arial" w:cs="Arial" w:eastAsia="Arial" w:hAnsi="Arial"/>
+                <w:b/>
+                <w:bCs/>
+                <w:sz w:val="21"/>
+                <w:szCs w:val="21"/>
+              </w:rPr>
+              <w:t xml:space="preserve">📞 WhatsApp: </w:t>
+            </w:r>
+            <w:r>
+              <w:rPr>
+                <w:rFonts w:ascii="Arial" w:cs="Arial" w:eastAsia="Arial" w:hAnsi="Arial"/>
+                <w:b/>
+                <w:bCs/>
+                <w:color w:val="E11D2E"/>
+                <w:sz w:val="24"/>
+                <w:szCs w:val="24"/>
+              </w:rPr>
+              <w:t xml:space="preserve">6901-9379</w:t>
+            </w:r>
+          </w:p>
+          <w:p>
+            <w:pPr>
+              <w:spacing w:after="40"/>
+            </w:pPr>
+            <w:hyperlink w:history="1" r:id="rIdoqf1h37ongyshefjb7v14">
+              <w:r>
+                <w:rPr>
+                  <w:rStyle w:val="Hyperlink"/>
+                  <w:rFonts w:ascii="Arial" w:cs="Arial" w:eastAsia="Arial" w:hAnsi="Arial"/>
+                  <w:sz w:val="19"/>
+                  <w:szCs w:val="19"/>
+                </w:rPr>
+                <w:t xml:space="preserve">Escribirle por WhatsApp (mensaje listo)</w:t>
+              </w:r>
+            </w:hyperlink>
+          </w:p>
+          <w:p>
+            <w:pPr>
+              <w:spacing w:after="0"/>
+            </w:pPr>
+            <w:hyperlink w:history="1" r:id="rIdqus-quha-7-eih_m3axpw">
               <w:r>
                 <w:rPr>
                   <w:rStyle w:val="Hyperlink"/>
@@ -8947,9 +9253,33 @@
           </w:p>
           <w:p>
             <w:pPr>
-              <w:spacing w:after="0"/>
-            </w:pPr>
-            <w:hyperlink w:history="1" r:id="rIdnjpzyzj4cfm8n-is-95ct">
+              <w:spacing w:after="40"/>
+            </w:pPr>
+            <w:r>
+              <w:rPr>
+                <w:rFonts w:ascii="Arial" w:cs="Arial" w:eastAsia="Arial" w:hAnsi="Arial"/>
+                <w:b/>
+                <w:bCs/>
+                <w:sz w:val="21"/>
+                <w:szCs w:val="21"/>
+              </w:rPr>
+              <w:t xml:space="preserve">📞 Teléfono: </w:t>
+            </w:r>
+            <w:r>
+              <w:rPr>
+                <w:rFonts w:ascii="Arial" w:cs="Arial" w:eastAsia="Arial" w:hAnsi="Arial"/>
+                <w:color w:val="5B6270"/>
+                <w:sz w:val="18"/>
+                <w:szCs w:val="18"/>
+              </w:rPr>
+              <w:t xml:space="preserve">oculto por encuentra24.com. Toca “Abrir anuncio” y luego el botón verde de WhatsApp o “Ver teléfono”.</w:t>
+            </w:r>
+          </w:p>
+          <w:p>
+            <w:pPr>
+              <w:spacing w:after="0"/>
+            </w:pPr>
+            <w:hyperlink w:history="1" r:id="rIdlmiah8mludwyqspfndpro">
               <w:r>
                 <w:rPr>
                   <w:rStyle w:val="Hyperlink"/>
@@ -9100,9 +9430,33 @@
           </w:p>
           <w:p>
             <w:pPr>
-              <w:spacing w:after="0"/>
-            </w:pPr>
-            <w:hyperlink w:history="1" r:id="rIdsevfc8zzzqoettkoejz-8">
+              <w:spacing w:after="40"/>
+            </w:pPr>
+            <w:r>
+              <w:rPr>
+                <w:rFonts w:ascii="Arial" w:cs="Arial" w:eastAsia="Arial" w:hAnsi="Arial"/>
+                <w:b/>
+                <w:bCs/>
+                <w:sz w:val="21"/>
+                <w:szCs w:val="21"/>
+              </w:rPr>
+              <w:t xml:space="preserve">📞 Teléfono: </w:t>
+            </w:r>
+            <w:r>
+              <w:rPr>
+                <w:rFonts w:ascii="Arial" w:cs="Arial" w:eastAsia="Arial" w:hAnsi="Arial"/>
+                <w:color w:val="5B6270"/>
+                <w:sz w:val="18"/>
+                <w:szCs w:val="18"/>
+              </w:rPr>
+              <w:t xml:space="preserve">oculto por encuentra24.com. Toca “Abrir anuncio” y luego el botón verde de WhatsApp o “Ver teléfono”.</w:t>
+            </w:r>
+          </w:p>
+          <w:p>
+            <w:pPr>
+              <w:spacing w:after="0"/>
+            </w:pPr>
+            <w:hyperlink w:history="1" r:id="rIdn-0ux8gec3viiwzp0ee6n">
               <w:r>
                 <w:rPr>
                   <w:rStyle w:val="Hyperlink"/>
@@ -9131,7 +9485,7 @@
         </w:rPr>
         <w:t xml:space="preserve">Buscar más hoy: </w:t>
       </w:r>
-      <w:hyperlink w:history="1" r:id="rIdtplqih7rzegn17wyhhic4">
+      <w:hyperlink w:history="1" r:id="rIdjs-yeg8nk9o8cahz5ekpy">
         <w:r>
           <w:rPr>
             <w:rStyle w:val="Hyperlink"/>
@@ -9150,7 +9504,7 @@
         </w:rPr>
         <w:t xml:space="preserve">   ·   </w:t>
       </w:r>
-      <w:hyperlink w:history="1" r:id="rIdme01iplmtzao85lzlalix">
+      <w:hyperlink w:history="1" r:id="rIdk7kgi8objah14wxr0yidf">
         <w:r>
           <w:rPr>
             <w:rStyle w:val="Hyperlink"/>
@@ -9918,9 +10272,33 @@
           </w:p>
           <w:p>
             <w:pPr>
-              <w:spacing w:after="0"/>
-            </w:pPr>
-            <w:hyperlink w:history="1" r:id="rIdamsy_d0lcfoluqw4olfwa">
+              <w:spacing w:after="40"/>
+            </w:pPr>
+            <w:r>
+              <w:rPr>
+                <w:rFonts w:ascii="Arial" w:cs="Arial" w:eastAsia="Arial" w:hAnsi="Arial"/>
+                <w:b/>
+                <w:bCs/>
+                <w:sz w:val="21"/>
+                <w:szCs w:val="21"/>
+              </w:rPr>
+              <w:t xml:space="preserve">📞 Teléfono: </w:t>
+            </w:r>
+            <w:r>
+              <w:rPr>
+                <w:rFonts w:ascii="Arial" w:cs="Arial" w:eastAsia="Arial" w:hAnsi="Arial"/>
+                <w:color w:val="5B6270"/>
+                <w:sz w:val="18"/>
+                <w:szCs w:val="18"/>
+              </w:rPr>
+              <w:t xml:space="preserve">oculto por encuentra24.com. Toca “Abrir anuncio” y luego el botón verde de WhatsApp o “Ver teléfono”.</w:t>
+            </w:r>
+          </w:p>
+          <w:p>
+            <w:pPr>
+              <w:spacing w:after="0"/>
+            </w:pPr>
+            <w:hyperlink w:history="1" r:id="rIdzvmjfh_fogjswdcyhykvx">
               <w:r>
                 <w:rPr>
                   <w:rStyle w:val="Hyperlink"/>
@@ -10071,9 +10449,33 @@
           </w:p>
           <w:p>
             <w:pPr>
-              <w:spacing w:after="0"/>
-            </w:pPr>
-            <w:hyperlink w:history="1" r:id="rIdi1bpeibiunsxch2unfar6">
+              <w:spacing w:after="40"/>
+            </w:pPr>
+            <w:r>
+              <w:rPr>
+                <w:rFonts w:ascii="Arial" w:cs="Arial" w:eastAsia="Arial" w:hAnsi="Arial"/>
+                <w:b/>
+                <w:bCs/>
+                <w:sz w:val="21"/>
+                <w:szCs w:val="21"/>
+              </w:rPr>
+              <w:t xml:space="preserve">📞 Teléfono: </w:t>
+            </w:r>
+            <w:r>
+              <w:rPr>
+                <w:rFonts w:ascii="Arial" w:cs="Arial" w:eastAsia="Arial" w:hAnsi="Arial"/>
+                <w:color w:val="5B6270"/>
+                <w:sz w:val="18"/>
+                <w:szCs w:val="18"/>
+              </w:rPr>
+              <w:t xml:space="preserve">oculto por encuentra24.com. Toca “Abrir anuncio” y luego el botón verde de WhatsApp o “Ver teléfono”.</w:t>
+            </w:r>
+          </w:p>
+          <w:p>
+            <w:pPr>
+              <w:spacing w:after="0"/>
+            </w:pPr>
+            <w:hyperlink w:history="1" r:id="rIdgjccpzshtoriqfm7icoem">
               <w:r>
                 <w:rPr>
                   <w:rStyle w:val="Hyperlink"/>
@@ -10102,7 +10504,7 @@
         </w:rPr>
         <w:t xml:space="preserve">Buscar más hoy: </w:t>
       </w:r>
-      <w:hyperlink w:history="1" r:id="rIdsndkei25jmm4zegchbtrf">
+      <w:hyperlink w:history="1" r:id="rId3ullmxghfcrbqdk3rqqna">
         <w:r>
           <w:rPr>
             <w:rStyle w:val="Hyperlink"/>
@@ -10121,7 +10523,7 @@
         </w:rPr>
         <w:t xml:space="preserve">   ·   </w:t>
       </w:r>
-      <w:hyperlink w:history="1" r:id="rId4yddbdpplo4kftoil4pqh">
+      <w:hyperlink w:history="1" r:id="rId-pvlpr40zasdrvvfeezdm">
         <w:r>
           <w:rPr>
             <w:rStyle w:val="Hyperlink"/>
@@ -10889,9 +11291,33 @@
           </w:p>
           <w:p>
             <w:pPr>
-              <w:spacing w:after="0"/>
-            </w:pPr>
-            <w:hyperlink w:history="1" r:id="rIdgcbt2wgdixpdvzy9drawl">
+              <w:spacing w:after="40"/>
+            </w:pPr>
+            <w:r>
+              <w:rPr>
+                <w:rFonts w:ascii="Arial" w:cs="Arial" w:eastAsia="Arial" w:hAnsi="Arial"/>
+                <w:b/>
+                <w:bCs/>
+                <w:sz w:val="21"/>
+                <w:szCs w:val="21"/>
+              </w:rPr>
+              <w:t xml:space="preserve">📞 Teléfono: </w:t>
+            </w:r>
+            <w:r>
+              <w:rPr>
+                <w:rFonts w:ascii="Arial" w:cs="Arial" w:eastAsia="Arial" w:hAnsi="Arial"/>
+                <w:color w:val="5B6270"/>
+                <w:sz w:val="18"/>
+                <w:szCs w:val="18"/>
+              </w:rPr>
+              <w:t xml:space="preserve">oculto por carrocarros.com. Toca “Abrir anuncio” y luego el botón verde de WhatsApp o “Ver teléfono”.</w:t>
+            </w:r>
+          </w:p>
+          <w:p>
+            <w:pPr>
+              <w:spacing w:after="0"/>
+            </w:pPr>
+            <w:hyperlink w:history="1" r:id="rIdbbk5eknh264fheakrxuwr">
               <w:r>
                 <w:rPr>
                   <w:rStyle w:val="Hyperlink"/>
@@ -11042,9 +11468,33 @@
           </w:p>
           <w:p>
             <w:pPr>
-              <w:spacing w:after="0"/>
-            </w:pPr>
-            <w:hyperlink w:history="1" r:id="rIdz6m1aojyjhanthwx2n-db">
+              <w:spacing w:after="40"/>
+            </w:pPr>
+            <w:r>
+              <w:rPr>
+                <w:rFonts w:ascii="Arial" w:cs="Arial" w:eastAsia="Arial" w:hAnsi="Arial"/>
+                <w:b/>
+                <w:bCs/>
+                <w:sz w:val="21"/>
+                <w:szCs w:val="21"/>
+              </w:rPr>
+              <w:t xml:space="preserve">📞 Teléfono: </w:t>
+            </w:r>
+            <w:r>
+              <w:rPr>
+                <w:rFonts w:ascii="Arial" w:cs="Arial" w:eastAsia="Arial" w:hAnsi="Arial"/>
+                <w:color w:val="5B6270"/>
+                <w:sz w:val="18"/>
+                <w:szCs w:val="18"/>
+              </w:rPr>
+              <w:t xml:space="preserve">oculto por carros.com. Toca “Abrir anuncio” y luego el botón verde de WhatsApp o “Ver teléfono”.</w:t>
+            </w:r>
+          </w:p>
+          <w:p>
+            <w:pPr>
+              <w:spacing w:after="0"/>
+            </w:pPr>
+            <w:hyperlink w:history="1" r:id="rIdtjvu8jlcdzl_r6-d_ntl-">
               <w:r>
                 <w:rPr>
                   <w:rStyle w:val="Hyperlink"/>
@@ -11165,9 +11615,33 @@
           </w:p>
           <w:p>
             <w:pPr>
-              <w:spacing w:after="0"/>
-            </w:pPr>
-            <w:hyperlink w:history="1" r:id="rIdtpcnaskkmzh3og1kgjoiq">
+              <w:spacing w:after="40"/>
+            </w:pPr>
+            <w:r>
+              <w:rPr>
+                <w:rFonts w:ascii="Arial" w:cs="Arial" w:eastAsia="Arial" w:hAnsi="Arial"/>
+                <w:b/>
+                <w:bCs/>
+                <w:sz w:val="21"/>
+                <w:szCs w:val="21"/>
+              </w:rPr>
+              <w:t xml:space="preserve">📞 Teléfono: </w:t>
+            </w:r>
+            <w:r>
+              <w:rPr>
+                <w:rFonts w:ascii="Arial" w:cs="Arial" w:eastAsia="Arial" w:hAnsi="Arial"/>
+                <w:color w:val="5B6270"/>
+                <w:sz w:val="18"/>
+                <w:szCs w:val="18"/>
+              </w:rPr>
+              <w:t xml:space="preserve">oculto por encuentra24.com. Toca “Abrir anuncio” y luego el botón verde de WhatsApp o “Ver teléfono”.</w:t>
+            </w:r>
+          </w:p>
+          <w:p>
+            <w:pPr>
+              <w:spacing w:after="0"/>
+            </w:pPr>
+            <w:hyperlink w:history="1" r:id="rIdgykf7sofvyoddq39kzcvl">
               <w:r>
                 <w:rPr>
                   <w:rStyle w:val="Hyperlink"/>
@@ -11196,7 +11670,7 @@
         </w:rPr>
         <w:t xml:space="preserve">Buscar más hoy: </w:t>
       </w:r>
-      <w:hyperlink w:history="1" r:id="rId-lhubm_llyxluckitzbag">
+      <w:hyperlink w:history="1" r:id="rIdw2sbxq7omuah1uy_2ndoj">
         <w:r>
           <w:rPr>
             <w:rStyle w:val="Hyperlink"/>
@@ -11215,7 +11689,7 @@
         </w:rPr>
         <w:t xml:space="preserve">   ·   </w:t>
       </w:r>
-      <w:hyperlink w:history="1" r:id="rIdm15gif_1vxmjvfnbx3j-g">
+      <w:hyperlink w:history="1" r:id="rIdfbwq32j9p2kmxzokihms4">
         <w:r>
           <w:rPr>
             <w:rStyle w:val="Hyperlink"/>
@@ -11983,9 +12457,33 @@
           </w:p>
           <w:p>
             <w:pPr>
-              <w:spacing w:after="0"/>
-            </w:pPr>
-            <w:hyperlink w:history="1" r:id="rIdt7riswxmxfl77evlx3hhn">
+              <w:spacing w:after="40"/>
+            </w:pPr>
+            <w:r>
+              <w:rPr>
+                <w:rFonts w:ascii="Arial" w:cs="Arial" w:eastAsia="Arial" w:hAnsi="Arial"/>
+                <w:b/>
+                <w:bCs/>
+                <w:sz w:val="21"/>
+                <w:szCs w:val="21"/>
+              </w:rPr>
+              <w:t xml:space="preserve">📞 Teléfono: </w:t>
+            </w:r>
+            <w:r>
+              <w:rPr>
+                <w:rFonts w:ascii="Arial" w:cs="Arial" w:eastAsia="Arial" w:hAnsi="Arial"/>
+                <w:color w:val="5B6270"/>
+                <w:sz w:val="18"/>
+                <w:szCs w:val="18"/>
+              </w:rPr>
+              <w:t xml:space="preserve">oculto por carrocarros.com. Toca “Abrir anuncio” y luego el botón verde de WhatsApp o “Ver teléfono”.</w:t>
+            </w:r>
+          </w:p>
+          <w:p>
+            <w:pPr>
+              <w:spacing w:after="0"/>
+            </w:pPr>
+            <w:hyperlink w:history="1" r:id="rIdqh2bb1039y0phbgtp0egp">
               <w:r>
                 <w:rPr>
                   <w:rStyle w:val="Hyperlink"/>
@@ -12136,9 +12634,33 @@
           </w:p>
           <w:p>
             <w:pPr>
-              <w:spacing w:after="0"/>
-            </w:pPr>
-            <w:hyperlink w:history="1" r:id="rIdi9k6digolycrmolmboqpw">
+              <w:spacing w:after="40"/>
+            </w:pPr>
+            <w:r>
+              <w:rPr>
+                <w:rFonts w:ascii="Arial" w:cs="Arial" w:eastAsia="Arial" w:hAnsi="Arial"/>
+                <w:b/>
+                <w:bCs/>
+                <w:sz w:val="21"/>
+                <w:szCs w:val="21"/>
+              </w:rPr>
+              <w:t xml:space="preserve">📞 Teléfono: </w:t>
+            </w:r>
+            <w:r>
+              <w:rPr>
+                <w:rFonts w:ascii="Arial" w:cs="Arial" w:eastAsia="Arial" w:hAnsi="Arial"/>
+                <w:color w:val="5B6270"/>
+                <w:sz w:val="18"/>
+                <w:szCs w:val="18"/>
+              </w:rPr>
+              <w:t xml:space="preserve">oculto por encuentra24.com. Toca “Abrir anuncio” y luego el botón verde de WhatsApp o “Ver teléfono”.</w:t>
+            </w:r>
+          </w:p>
+          <w:p>
+            <w:pPr>
+              <w:spacing w:after="0"/>
+            </w:pPr>
+            <w:hyperlink w:history="1" r:id="rIdhuzondriq2sbjohxdnmhr">
               <w:r>
                 <w:rPr>
                   <w:rStyle w:val="Hyperlink"/>
@@ -12259,9 +12781,33 @@
           </w:p>
           <w:p>
             <w:pPr>
-              <w:spacing w:after="0"/>
-            </w:pPr>
-            <w:hyperlink w:history="1" r:id="rId4xmyzyxefat4f1gw6zudd">
+              <w:spacing w:after="40"/>
+            </w:pPr>
+            <w:r>
+              <w:rPr>
+                <w:rFonts w:ascii="Arial" w:cs="Arial" w:eastAsia="Arial" w:hAnsi="Arial"/>
+                <w:b/>
+                <w:bCs/>
+                <w:sz w:val="21"/>
+                <w:szCs w:val="21"/>
+              </w:rPr>
+              <w:t xml:space="preserve">📞 Teléfono: </w:t>
+            </w:r>
+            <w:r>
+              <w:rPr>
+                <w:rFonts w:ascii="Arial" w:cs="Arial" w:eastAsia="Arial" w:hAnsi="Arial"/>
+                <w:color w:val="5B6270"/>
+                <w:sz w:val="18"/>
+                <w:szCs w:val="18"/>
+              </w:rPr>
+              <w:t xml:space="preserve">oculto por encuentra24.com. Toca “Abrir anuncio” y luego el botón verde de WhatsApp o “Ver teléfono”.</w:t>
+            </w:r>
+          </w:p>
+          <w:p>
+            <w:pPr>
+              <w:spacing w:after="0"/>
+            </w:pPr>
+            <w:hyperlink w:history="1" r:id="rIdtuo5e1f9fbo4_68njod8g">
               <w:r>
                 <w:rPr>
                   <w:rStyle w:val="Hyperlink"/>
@@ -12290,7 +12836,7 @@
         </w:rPr>
         <w:t xml:space="preserve">Buscar más hoy: </w:t>
       </w:r>
-      <w:hyperlink w:history="1" r:id="rId1kvuy_pavglihxvlxjjye">
+      <w:hyperlink w:history="1" r:id="rIdfoxbs_wx7p-mern4-yq1o">
         <w:r>
           <w:rPr>
             <w:rStyle w:val="Hyperlink"/>
@@ -12309,7 +12855,7 @@
         </w:rPr>
         <w:t xml:space="preserve">   ·   </w:t>
       </w:r>
-      <w:hyperlink w:history="1" r:id="rIdxldlwpaxgvzauxlywzi2f">
+      <w:hyperlink w:history="1" r:id="rIdcxzz7d2r6az2yk-yqofru">
         <w:r>
           <w:rPr>
             <w:rStyle w:val="Hyperlink"/>
@@ -13077,9 +13623,33 @@
           </w:p>
           <w:p>
             <w:pPr>
-              <w:spacing w:after="0"/>
-            </w:pPr>
-            <w:hyperlink w:history="1" r:id="rIdehejdz71wu8vdpkynhrvc">
+              <w:spacing w:after="40"/>
+            </w:pPr>
+            <w:r>
+              <w:rPr>
+                <w:rFonts w:ascii="Arial" w:cs="Arial" w:eastAsia="Arial" w:hAnsi="Arial"/>
+                <w:b/>
+                <w:bCs/>
+                <w:sz w:val="21"/>
+                <w:szCs w:val="21"/>
+              </w:rPr>
+              <w:t xml:space="preserve">📞 Teléfono: </w:t>
+            </w:r>
+            <w:r>
+              <w:rPr>
+                <w:rFonts w:ascii="Arial" w:cs="Arial" w:eastAsia="Arial" w:hAnsi="Arial"/>
+                <w:color w:val="5B6270"/>
+                <w:sz w:val="18"/>
+                <w:szCs w:val="18"/>
+              </w:rPr>
+              <w:t xml:space="preserve">oculto por carrocarros.com. Toca “Abrir anuncio” y luego el botón verde de WhatsApp o “Ver teléfono”.</w:t>
+            </w:r>
+          </w:p>
+          <w:p>
+            <w:pPr>
+              <w:spacing w:after="0"/>
+            </w:pPr>
+            <w:hyperlink w:history="1" r:id="rIdk9qbo-ydfegvkxcurgpoq">
               <w:r>
                 <w:rPr>
                   <w:rStyle w:val="Hyperlink"/>
@@ -13230,9 +13800,33 @@
           </w:p>
           <w:p>
             <w:pPr>
-              <w:spacing w:after="0"/>
-            </w:pPr>
-            <w:hyperlink w:history="1" r:id="rId7-q1eb9srbr4dqy0bsk1i">
+              <w:spacing w:after="40"/>
+            </w:pPr>
+            <w:r>
+              <w:rPr>
+                <w:rFonts w:ascii="Arial" w:cs="Arial" w:eastAsia="Arial" w:hAnsi="Arial"/>
+                <w:b/>
+                <w:bCs/>
+                <w:sz w:val="21"/>
+                <w:szCs w:val="21"/>
+              </w:rPr>
+              <w:t xml:space="preserve">📞 Teléfono: </w:t>
+            </w:r>
+            <w:r>
+              <w:rPr>
+                <w:rFonts w:ascii="Arial" w:cs="Arial" w:eastAsia="Arial" w:hAnsi="Arial"/>
+                <w:color w:val="5B6270"/>
+                <w:sz w:val="18"/>
+                <w:szCs w:val="18"/>
+              </w:rPr>
+              <w:t xml:space="preserve">oculto por encuentra24.com. Toca “Abrir anuncio” y luego el botón verde de WhatsApp o “Ver teléfono”.</w:t>
+            </w:r>
+          </w:p>
+          <w:p>
+            <w:pPr>
+              <w:spacing w:after="0"/>
+            </w:pPr>
+            <w:hyperlink w:history="1" r:id="rIdw_0yqnah-jbvicfv839af">
               <w:r>
                 <w:rPr>
                   <w:rStyle w:val="Hyperlink"/>
@@ -13383,9 +13977,33 @@
           </w:p>
           <w:p>
             <w:pPr>
-              <w:spacing w:after="0"/>
-            </w:pPr>
-            <w:hyperlink w:history="1" r:id="rId_gkrx6pssfpawwiudqkyn">
+              <w:spacing w:after="40"/>
+            </w:pPr>
+            <w:r>
+              <w:rPr>
+                <w:rFonts w:ascii="Arial" w:cs="Arial" w:eastAsia="Arial" w:hAnsi="Arial"/>
+                <w:b/>
+                <w:bCs/>
+                <w:sz w:val="21"/>
+                <w:szCs w:val="21"/>
+              </w:rPr>
+              <w:t xml:space="preserve">📞 Teléfono: </w:t>
+            </w:r>
+            <w:r>
+              <w:rPr>
+                <w:rFonts w:ascii="Arial" w:cs="Arial" w:eastAsia="Arial" w:hAnsi="Arial"/>
+                <w:color w:val="5B6270"/>
+                <w:sz w:val="18"/>
+                <w:szCs w:val="18"/>
+              </w:rPr>
+              <w:t xml:space="preserve">oculto por encuentra24.com. Toca “Abrir anuncio” y luego el botón verde de WhatsApp o “Ver teléfono”.</w:t>
+            </w:r>
+          </w:p>
+          <w:p>
+            <w:pPr>
+              <w:spacing w:after="0"/>
+            </w:pPr>
+            <w:hyperlink w:history="1" r:id="rIdsrvn7m32vrdqdzpxozn2b">
               <w:r>
                 <w:rPr>
                   <w:rStyle w:val="Hyperlink"/>
@@ -13414,7 +14032,7 @@
         </w:rPr>
         <w:t xml:space="preserve">Buscar más hoy: </w:t>
       </w:r>
-      <w:hyperlink w:history="1" r:id="rId1rugneoqy0c4fgnstz5wj">
+      <w:hyperlink w:history="1" r:id="rIdw974qncvsl4bhrye5mqgp">
         <w:r>
           <w:rPr>
             <w:rStyle w:val="Hyperlink"/>
@@ -13433,7 +14051,7 @@
         </w:rPr>
         <w:t xml:space="preserve">   ·   </w:t>
       </w:r>
-      <w:hyperlink w:history="1" r:id="rId2fzr5kvoec6tp7mkqp7kb">
+      <w:hyperlink w:history="1" r:id="rIdg67fuzteng44hsgcmhkgx">
         <w:r>
           <w:rPr>
             <w:rStyle w:val="Hyperlink"/>

</xml_diff>